<commit_message>
40_AWS: 改修依頼 No.X見出しをH1に昇格 (2026-03-09)
</commit_message>
<xml_diff>
--- a/40_AWS/04_修正依頼/20260309_AWS_セキュリティ改修依頼.docx
+++ b/40_AWS/04_修正依頼/20260309_AWS_セキュリティ改修依頼.docx
@@ -3783,15 +3783,15 @@
     </w:p>
     <w:p>
       <w:pPr>
-        <w:pStyle w:val="Heading2"/>
+        <w:pStyle w:val="Heading1"/>
       </w:pPr>
       <w:r>
         <w:rPr>
           <w:rFonts w:ascii="BIZ UDPゴシック" w:cs="BIZ UDPゴシック" w:eastAsia="BIZ UDPゴシック" w:hAnsi="BIZ UDPゴシック"/>
           <w:b/>
           <w:bCs/>
-          <w:sz w:val="18"/>
-          <w:szCs w:val="18"/>
+          <w:sz w:val="24"/>
+          <w:szCs w:val="24"/>
         </w:rPr>
         <w:t xml:space="preserve">■ No.1  MFA 全IAMユーザー強制 / Bắt buộc MFA cho tất cả IAM user</w:t>
       </w:r>
@@ -4876,15 +4876,15 @@
     </w:p>
     <w:p>
       <w:pPr>
-        <w:pStyle w:val="Heading2"/>
+        <w:pStyle w:val="Heading1"/>
       </w:pPr>
       <w:r>
         <w:rPr>
           <w:rFonts w:ascii="BIZ UDPゴシック" w:cs="BIZ UDPゴシック" w:eastAsia="BIZ UDPゴシック" w:hAnsi="BIZ UDPゴシック"/>
           <w:b/>
           <w:bCs/>
-          <w:sz w:val="18"/>
-          <w:szCs w:val="18"/>
+          <w:sz w:val="24"/>
+          <w:szCs w:val="24"/>
         </w:rPr>
         <w:t xml:space="preserve">■ No.2  PowerUserAccess削除 / Xóa PowerUserAccess</w:t>
       </w:r>
@@ -5995,15 +5995,15 @@
     </w:p>
     <w:p>
       <w:pPr>
-        <w:pStyle w:val="Heading2"/>
+        <w:pStyle w:val="Heading1"/>
       </w:pPr>
       <w:r>
         <w:rPr>
           <w:rFonts w:ascii="BIZ UDPゴシック" w:cs="BIZ UDPゴシック" w:eastAsia="BIZ UDPゴシック" w:hAnsi="BIZ UDPゴシック"/>
           <w:b/>
           <w:bCs/>
-          <w:sz w:val="18"/>
-          <w:szCs w:val="18"/>
+          <w:sz w:val="24"/>
+          <w:szCs w:val="24"/>
         </w:rPr>
         <w:t xml:space="preserve">■ No.5  web-be SG 全トラフィック許可ルール削除 / Xóa rule cho phép toàn bộ traffic trên SG web-be</w:t>
       </w:r>
@@ -7088,15 +7088,15 @@
     </w:p>
     <w:p>
       <w:pPr>
-        <w:pStyle w:val="Heading2"/>
+        <w:pStyle w:val="Heading1"/>
       </w:pPr>
       <w:r>
         <w:rPr>
           <w:rFonts w:ascii="BIZ UDPゴシック" w:cs="BIZ UDPゴシック" w:eastAsia="BIZ UDPゴシック" w:hAnsi="BIZ UDPゴシック"/>
           <w:b/>
           <w:bCs/>
-          <w:sz w:val="18"/>
-          <w:szCs w:val="18"/>
+          <w:sz w:val="24"/>
+          <w:szCs w:val="24"/>
         </w:rPr>
         <w:t xml:space="preserve">■ No.13  Transfer Family SG Bastion許可ルール削除(STG) / Xóa rule cho phép Bastion trong SG Transfer Family (STG)</w:t>
       </w:r>
@@ -8246,15 +8246,15 @@
     </w:p>
     <w:p>
       <w:pPr>
-        <w:pStyle w:val="Heading2"/>
+        <w:pStyle w:val="Heading1"/>
       </w:pPr>
       <w:r>
         <w:rPr>
           <w:rFonts w:ascii="BIZ UDPゴシック" w:cs="BIZ UDPゴシック" w:eastAsia="BIZ UDPゴシック" w:hAnsi="BIZ UDPゴシック"/>
           <w:b/>
           <w:bCs/>
-          <w:sz w:val="18"/>
-          <w:szCs w:val="18"/>
+          <w:sz w:val="24"/>
+          <w:szCs w:val="24"/>
         </w:rPr>
         <w:t xml:space="preserve">■ No.14  EventBridge 残骸ルール削除(STG) / Xóa rule EventBridge còn sót lại (STG)</w:t>
       </w:r>
@@ -9456,15 +9456,15 @@
     </w:p>
     <w:p>
       <w:pPr>
-        <w:pStyle w:val="Heading2"/>
+        <w:pStyle w:val="Heading1"/>
       </w:pPr>
       <w:r>
         <w:rPr>
           <w:rFonts w:ascii="BIZ UDPゴシック" w:cs="BIZ UDPゴシック" w:eastAsia="BIZ UDPゴシック" w:hAnsi="BIZ UDPゴシック"/>
           <w:b/>
           <w:bCs/>
-          <w:sz w:val="18"/>
-          <w:szCs w:val="18"/>
+          <w:sz w:val="24"/>
+          <w:szCs w:val="24"/>
         </w:rPr>
         <w:t xml:space="preserve">■ No.15  Lambda命名修正 / Đổi tên Lambda (PRD)</w:t>
       </w:r>
@@ -10679,15 +10679,15 @@
     </w:p>
     <w:p>
       <w:pPr>
-        <w:pStyle w:val="Heading2"/>
+        <w:pStyle w:val="Heading1"/>
       </w:pPr>
       <w:r>
         <w:rPr>
           <w:rFonts w:ascii="BIZ UDPゴシック" w:cs="BIZ UDPゴシック" w:eastAsia="BIZ UDPゴシック" w:hAnsi="BIZ UDPゴシック"/>
           <w:b/>
           <w:bCs/>
-          <w:sz w:val="18"/>
-          <w:szCs w:val="18"/>
+          <w:sz w:val="24"/>
+          <w:szCs w:val="24"/>
         </w:rPr>
         <w:t xml:space="preserve">■ No.16  giftcard EC2 CloudWatch Logs整備 / Thiết lập CloudWatch Logs cho EC2 giftcard</w:t>
       </w:r>

</xml_diff>